<commit_message>
added disclamer in investigation about future objectives.
</commit_message>
<xml_diff>
--- a/Investigation.docx
+++ b/Investigation.docx
@@ -10719,6 +10719,56 @@
         </w:rPr>
       </w:pPr>
     </w:p>
+    <w:p>
+      <w:pPr>
+        <w:spacing w:after="80" w:line="276" w:lineRule="auto"/>
+        <w:jc w:val="both"/>
+        <w:rPr>
+          <w:b/>
+          <w:bCs/>
+          <w:color w:val="EE0000"/>
+        </w:rPr>
+      </w:pPr>
+      <w:r>
+        <w:rPr>
+          <w:b/>
+          <w:bCs/>
+          <w:color w:val="EE0000"/>
+          <w:highlight w:val="yellow"/>
+        </w:rPr>
+        <w:t xml:space="preserve">The eighteen objectives above were written before any of </w:t>
+      </w:r>
+      <w:proofErr w:type="spellStart"/>
+      <w:r>
+        <w:rPr>
+          <w:b/>
+          <w:bCs/>
+          <w:color w:val="EE0000"/>
+          <w:highlight w:val="yellow"/>
+        </w:rPr>
+        <w:t>Filmtopia</w:t>
+      </w:r>
+      <w:proofErr w:type="spellEnd"/>
+      <w:r>
+        <w:rPr>
+          <w:b/>
+          <w:bCs/>
+          <w:color w:val="EE0000"/>
+          <w:highlight w:val="yellow"/>
+        </w:rPr>
+        <w:t xml:space="preserve"> existed, and building the prototype showed that they did not cover the whole problem. Some of the gaps came out of the feedback sessions, some came out of using the prototype myself for a few weeks, and a few came out of faults that only appeared once there was real data in the database. Rather than quietly widen the original objectives so that whatever I happened to build would satisfy them, which would make the evaluation worthless, I have written the additional requirements down as a second set of objectives with their own success criteria. Everything from Objective 19 onwards was identified after the prototype was finished, and none of it was part of the prototype build.</w:t>
+      </w:r>
+    </w:p>
+    <w:p>
+      <w:pPr>
+        <w:spacing w:after="80" w:line="276" w:lineRule="auto"/>
+        <w:jc w:val="both"/>
+        <w:rPr>
+          <w:b/>
+          <w:bCs/>
+        </w:rPr>
+      </w:pPr>
+    </w:p>
     <w:sectPr>
       <w:headerReference w:type="even" r:id="rId23"/>
       <w:headerReference w:type="default" r:id="rId24"/>
@@ -10841,7 +10891,6 @@
         <w:docPartUnique/>
       </w:docPartObj>
     </w:sdtPr>
-    <w:sdtEndPr/>
     <w:sdtContent>
       <w:p>
         <w:pPr>

</xml_diff>

<commit_message>
added objective 19 to the investigation doc
</commit_message>
<xml_diff>
--- a/Investigation.docx
+++ b/Investigation.docx
@@ -10,21 +10,12 @@
           <w:color w:val="A02B93" w:themeColor="accent5"/>
         </w:rPr>
       </w:pPr>
-      <w:proofErr w:type="spellStart"/>
       <w:r>
         <w:rPr>
           <w:b/>
           <w:color w:val="A02B93" w:themeColor="accent5"/>
         </w:rPr>
-        <w:t>Filmtopia</w:t>
-      </w:r>
-      <w:proofErr w:type="spellEnd"/>
-      <w:r>
-        <w:rPr>
-          <w:b/>
-          <w:color w:val="A02B93" w:themeColor="accent5"/>
-        </w:rPr>
-        <w:t xml:space="preserve"> Project Investigation</w:t>
+        <w:t>Filmtopia Project Investigation</w:t>
       </w:r>
     </w:p>
     <w:p>
@@ -47,29 +38,8 @@
       <w:pPr>
         <w:spacing w:line="276" w:lineRule="auto"/>
       </w:pPr>
-      <w:proofErr w:type="spellStart"/>
-      <w:r>
-        <w:t>Filmtopia</w:t>
-      </w:r>
-      <w:proofErr w:type="spellEnd"/>
-      <w:r>
-        <w:t xml:space="preserve"> is a small independent cinema theatre who is currently managing all business data using spreadsheets and paper. They sell food drinks and tickets using a variety of means such as a touchscreen kiosk which can only handle food and drinks and a concessions area where employees handle the business. The management of </w:t>
-      </w:r>
-      <w:proofErr w:type="spellStart"/>
-      <w:r>
-        <w:t>Filmtopia</w:t>
-      </w:r>
-      <w:proofErr w:type="spellEnd"/>
-      <w:r>
-        <w:t xml:space="preserve"> has come to notice that they are falling back on managing and analysing the cinema, this means keeping track of sales records, screening analytics and a customer interest evaluation. I am now going to investigate further on how </w:t>
-      </w:r>
-      <w:proofErr w:type="spellStart"/>
-      <w:r>
-        <w:t>Filmtopia</w:t>
-      </w:r>
-      <w:proofErr w:type="spellEnd"/>
-      <w:r>
-        <w:t xml:space="preserve"> functions to get a better understanding of how I should move with this project.</w:t>
+      <w:r>
+        <w:t>Filmtopia is a small independent cinema theatre who is currently managing all business data using spreadsheets and paper. They sell food drinks and tickets using a variety of means such as a touchscreen kiosk which can only handle food and drinks and a concessions area where employees handle the business. The management of Filmtopia has come to notice that they are falling back on managing and analysing the cinema, this means keeping track of sales records, screening analytics and a customer interest evaluation. I am now going to investigate further on how Filmtopia functions to get a better understanding of how I should move with this project.</w:t>
       </w:r>
       <w:r>
         <w:tab/>
@@ -106,15 +76,7 @@
         <w:spacing w:line="276" w:lineRule="auto"/>
       </w:pPr>
       <w:r>
-        <w:t xml:space="preserve">For the </w:t>
-      </w:r>
-      <w:proofErr w:type="spellStart"/>
-      <w:r>
-        <w:t>Filmtopia</w:t>
-      </w:r>
-      <w:proofErr w:type="spellEnd"/>
-      <w:r>
-        <w:t xml:space="preserve"> system the stakeholders can be split into two groups, primary and secondary. Primary stakeholders are those who will interact with the system directly on a regular basis. Secondary stakeholders are those who are affected by the system indirectly or whose work is influenced by it without them necessarily using it themselves.</w:t>
+        <w:t>For the Filmtopia system the stakeholders can be split into two groups, primary and secondary. Primary stakeholders are those who will interact with the system directly on a regular basis. Secondary stakeholders are those who are affected by the system indirectly or whose work is influenced by it without them necessarily using it themselves.</w:t>
       </w:r>
     </w:p>
     <w:p>
@@ -142,31 +104,7 @@
         <w:spacing w:line="276" w:lineRule="auto"/>
       </w:pPr>
       <w:r>
-        <w:t xml:space="preserve">The third primary stakeholder is the customer base of </w:t>
-      </w:r>
-      <w:proofErr w:type="spellStart"/>
-      <w:r>
-        <w:t>Filmtopia</w:t>
-      </w:r>
-      <w:proofErr w:type="spellEnd"/>
-      <w:r>
-        <w:t xml:space="preserve">. Customers interact with the system either directly through the proposed </w:t>
-      </w:r>
-      <w:proofErr w:type="spellStart"/>
-      <w:r>
-        <w:t>self service</w:t>
-      </w:r>
-      <w:proofErr w:type="spellEnd"/>
-      <w:r>
-        <w:t xml:space="preserve"> kiosk or indirectly when staff process their bookings on their behalf. Their main interests are convenience, short queue times and the assurance that the seat they have been allocated will actually be available when they arrive. The questionnaire results discussed later in this investigation show that a large majority of customers would prefer </w:t>
-      </w:r>
-      <w:proofErr w:type="spellStart"/>
-      <w:r>
-        <w:t>self service</w:t>
-      </w:r>
-      <w:proofErr w:type="spellEnd"/>
-      <w:r>
-        <w:t xml:space="preserve"> ticketing and that seat selection is considered important by most respondents. This means the bar for the kiosk interface is high and it needs to be clean and simple enough for any customer to use without assistance.</w:t>
+        <w:t>The third primary stakeholder is the customer base of Filmtopia. Customers interact with the system either directly through the proposed self service kiosk or indirectly when staff process their bookings on their behalf. Their main interests are convenience, short queue times and the assurance that the seat they have been allocated will actually be available when they arrive. The questionnaire results discussed later in this investigation show that a large majority of customers would prefer self service ticketing and that seat selection is considered important by most respondents. This means the bar for the kiosk interface is high and it needs to be clean and simple enough for any customer to use without assistance.</w:t>
       </w:r>
     </w:p>
     <w:p>
@@ -182,28 +120,12 @@
         <w:spacing w:line="276" w:lineRule="auto"/>
       </w:pPr>
       <w:r>
-        <w:t xml:space="preserve">Another secondary stakeholder is any external IT support that </w:t>
-      </w:r>
-      <w:proofErr w:type="spellStart"/>
-      <w:r>
-        <w:t>Filmtopia</w:t>
-      </w:r>
-      <w:proofErr w:type="spellEnd"/>
-      <w:r>
-        <w:t xml:space="preserve"> uses. As a small independent cinema there is no dedicated IT department meaning the system must be robust and straightforward to maintain. Complex setups that require specialist knowledge to troubleshoot would be impractical for a business of this size.</w:t>
-      </w:r>
-    </w:p>
-    <w:p>
-      <w:r>
-        <w:t xml:space="preserve">In summary the stakeholder analysis makes clear that the </w:t>
-      </w:r>
-      <w:proofErr w:type="spellStart"/>
-      <w:r>
-        <w:t>Filmtopia</w:t>
-      </w:r>
-      <w:proofErr w:type="spellEnd"/>
-      <w:r>
-        <w:t xml:space="preserve"> system needs to serve a wide range of users with different levels of technical confidence and different priorities. The investigation that follows has been designed to gather requirements from as many of these stakeholders as possible to ensure the final system genuinely reflects the needs of everyone who will be affected by it.</w:t>
+        <w:t>Another secondary stakeholder is any external IT support that Filmtopia uses. As a small independent cinema there is no dedicated IT department meaning the system must be robust and straightforward to maintain. Complex setups that require specialist knowledge to troubleshoot would be impractical for a business of this size.</w:t>
+      </w:r>
+    </w:p>
+    <w:p>
+      <w:r>
+        <w:t>In summary the stakeholder analysis makes clear that the Filmtopia system needs to serve a wide range of users with different levels of technical confidence and different priorities. The investigation that follows has been designed to gather requirements from as many of these stakeholders as possible to ensure the final system genuinely reflects the needs of everyone who will be affected by it.</w:t>
       </w:r>
     </w:p>
     <w:p>
@@ -755,52 +677,14 @@
                 <w:lang w:val="fr-FR"/>
               </w:rPr>
             </w:pPr>
-            <w:proofErr w:type="spellStart"/>
             <w:r>
               <w:rPr>
                 <w:sz w:val="20"/>
                 <w:szCs w:val="20"/>
                 <w:lang w:val="fr-FR"/>
               </w:rPr>
-              <w:t>Summarise</w:t>
+              <w:t>Summarise and interpret questionnaire responses</w:t>
             </w:r>
-            <w:proofErr w:type="spellEnd"/>
-            <w:r>
-              <w:rPr>
-                <w:sz w:val="20"/>
-                <w:szCs w:val="20"/>
-                <w:lang w:val="fr-FR"/>
-              </w:rPr>
-              <w:t xml:space="preserve"> and </w:t>
-            </w:r>
-            <w:proofErr w:type="spellStart"/>
-            <w:r>
-              <w:rPr>
-                <w:sz w:val="20"/>
-                <w:szCs w:val="20"/>
-                <w:lang w:val="fr-FR"/>
-              </w:rPr>
-              <w:t>interpret</w:t>
-            </w:r>
-            <w:proofErr w:type="spellEnd"/>
-            <w:r>
-              <w:rPr>
-                <w:sz w:val="20"/>
-                <w:szCs w:val="20"/>
-                <w:lang w:val="fr-FR"/>
-              </w:rPr>
-              <w:t xml:space="preserve"> questionnaire </w:t>
-            </w:r>
-            <w:proofErr w:type="spellStart"/>
-            <w:r>
-              <w:rPr>
-                <w:sz w:val="20"/>
-                <w:szCs w:val="20"/>
-                <w:lang w:val="fr-FR"/>
-              </w:rPr>
-              <w:t>responses</w:t>
-            </w:r>
-            <w:proofErr w:type="spellEnd"/>
           </w:p>
         </w:tc>
       </w:tr>
@@ -1596,15 +1480,7 @@
         <w:spacing w:line="276" w:lineRule="auto"/>
       </w:pPr>
       <w:r>
-        <w:t xml:space="preserve">Moving on to the customer questionnaire, this was chosen because it allowed a much larger group of stakeholders to contribute to the investigation than would have been possible through interviews alone. Interviewing every customer individually would not be realistic, so a questionnaire was the most practical way to gather their views. The key advantage of a questionnaire is that it produces quantitative data which is easier to summarise and use as justification for design decisions. For example knowing that a large majority of customers would prefer a </w:t>
-      </w:r>
-      <w:proofErr w:type="spellStart"/>
-      <w:r>
-        <w:t>self service</w:t>
-      </w:r>
-      <w:proofErr w:type="spellEnd"/>
-      <w:r>
-        <w:t xml:space="preserve"> kiosk is a much stronger argument for including that feature than one person mentioning it in an interview. The limitation of a questionnaire is that the questions are fixed which means there is no opportunity to follow up on responses or ask for more detail. To partially work around this some of the questions included a list of options rather than just a yes or no answer which produced more useful and specific data.</w:t>
+        <w:t>Moving on to the customer questionnaire, this was chosen because it allowed a much larger group of stakeholders to contribute to the investigation than would have been possible through interviews alone. Interviewing every customer individually would not be realistic, so a questionnaire was the most practical way to gather their views. The key advantage of a questionnaire is that it produces quantitative data which is easier to summarise and use as justification for design decisions. For example knowing that a large majority of customers would prefer a self service kiosk is a much stronger argument for including that feature than one person mentioning it in an interview. The limitation of a questionnaire is that the questions are fixed which means there is no opportunity to follow up on responses or ask for more detail. To partially work around this some of the questions included a list of options rather than just a yes or no answer which produced more useful and specific data.</w:t>
       </w:r>
     </w:p>
     <w:p>
@@ -1711,23 +1587,7 @@
           <w:b/>
           <w:bCs/>
         </w:rPr>
-        <w:t xml:space="preserve">Q: Can you describe how </w:t>
-      </w:r>
-      <w:proofErr w:type="spellStart"/>
-      <w:r>
-        <w:rPr>
-          <w:b/>
-          <w:bCs/>
-        </w:rPr>
-        <w:t>Filmtopia</w:t>
-      </w:r>
-      <w:proofErr w:type="spellEnd"/>
-      <w:r>
-        <w:rPr>
-          <w:b/>
-          <w:bCs/>
-        </w:rPr>
-        <w:t xml:space="preserve"> currently manages its ticketing and bookings?</w:t>
+        <w:t>Q: Can you describe how Filmtopia currently manages its ticketing and bookings?</w:t>
       </w:r>
     </w:p>
     <w:p>
@@ -1767,23 +1627,7 @@
           <w:b/>
           <w:bCs/>
         </w:rPr>
-        <w:t xml:space="preserve">Q: What data does </w:t>
-      </w:r>
-      <w:proofErr w:type="spellStart"/>
-      <w:r>
-        <w:rPr>
-          <w:b/>
-          <w:bCs/>
-        </w:rPr>
-        <w:t>Filmtopia</w:t>
-      </w:r>
-      <w:proofErr w:type="spellEnd"/>
-      <w:r>
-        <w:rPr>
-          <w:b/>
-          <w:bCs/>
-        </w:rPr>
-        <w:t xml:space="preserve"> currently store and how?</w:t>
+        <w:t>Q: What data does Filmtopia currently store and how?</w:t>
       </w:r>
     </w:p>
     <w:p>
@@ -2005,15 +1849,7 @@
         <w:spacing w:line="276" w:lineRule="auto"/>
       </w:pPr>
       <w:r>
-        <w:t xml:space="preserve">A questionnaire was distributed to customers visiting </w:t>
-      </w:r>
-      <w:proofErr w:type="spellStart"/>
-      <w:r>
-        <w:t>Filmtopia</w:t>
-      </w:r>
-      <w:proofErr w:type="spellEnd"/>
-      <w:r>
-        <w:t xml:space="preserve"> in order to gather feedback on their experience with the current system and to understand what they would want from a new one. It was administered on the 15th of January 2026 as a paper questionnaire handed to customers at the cinema, and 20 responses were collected. The questions and summarised responses are as follows.</w:t>
+        <w:t>A questionnaire was distributed to customers visiting Filmtopia in order to gather feedback on their experience with the current system and to understand what they would want from a new one. It was administered on the 15th of January 2026 as a paper questionnaire handed to customers at the cinema, and 20 responses were collected. The questions and summarised responses are as follows.</w:t>
       </w:r>
     </w:p>
     <w:p>
@@ -2082,29 +1918,7 @@
           <w:color w:val="000000" w:themeColor="text1"/>
         </w:rPr>
         <w:lastRenderedPageBreak/>
-        <w:t xml:space="preserve">Q1: How do you currently purchase your tickets at </w:t>
-      </w:r>
-      <w:proofErr w:type="spellStart"/>
-      <w:r>
-        <w:rPr>
-          <w:b/>
-          <w:bCs/>
-          <w:i w:val="0"/>
-          <w:iCs w:val="0"/>
-          <w:color w:val="000000" w:themeColor="text1"/>
-        </w:rPr>
-        <w:t>Filmtopia</w:t>
-      </w:r>
-      <w:proofErr w:type="spellEnd"/>
-      <w:r>
-        <w:rPr>
-          <w:b/>
-          <w:bCs/>
-          <w:i w:val="0"/>
-          <w:iCs w:val="0"/>
-          <w:color w:val="000000" w:themeColor="text1"/>
-        </w:rPr>
-        <w:t>?</w:t>
+        <w:t>Q1: How do you currently purchase your tickets at Filmtopia?</w:t>
       </w:r>
     </w:p>
     <w:tbl>
@@ -2353,29 +2167,7 @@
           <w:iCs w:val="0"/>
           <w:color w:val="000000" w:themeColor="text1"/>
         </w:rPr>
-        <w:t xml:space="preserve">Q2: Have you ever experienced a problem when booking tickets at </w:t>
-      </w:r>
-      <w:proofErr w:type="spellStart"/>
-      <w:r>
-        <w:rPr>
-          <w:b/>
-          <w:bCs/>
-          <w:i w:val="0"/>
-          <w:iCs w:val="0"/>
-          <w:color w:val="000000" w:themeColor="text1"/>
-        </w:rPr>
-        <w:t>Filmtopia</w:t>
-      </w:r>
-      <w:proofErr w:type="spellEnd"/>
-      <w:r>
-        <w:rPr>
-          <w:b/>
-          <w:bCs/>
-          <w:i w:val="0"/>
-          <w:iCs w:val="0"/>
-          <w:color w:val="000000" w:themeColor="text1"/>
-        </w:rPr>
-        <w:t>?</w:t>
+        <w:t>Q2: Have you ever experienced a problem when booking tickets at Filmtopia?</w:t>
       </w:r>
     </w:p>
     <w:tbl>
@@ -3400,15 +3192,7 @@
         <w:spacing w:line="276" w:lineRule="auto"/>
       </w:pPr>
       <w:r>
-        <w:t xml:space="preserve">85% of customers felt seat selection was at least quite important. This supports the planned graphical seat selection feature in the </w:t>
-      </w:r>
-      <w:proofErr w:type="spellStart"/>
-      <w:r>
-        <w:t>Filmtopia</w:t>
-      </w:r>
-      <w:proofErr w:type="spellEnd"/>
-      <w:r>
-        <w:t xml:space="preserve"> system.</w:t>
+        <w:t>85% of customers felt seat selection was at least quite important. This supports the planned graphical seat selection feature in the Filmtopia system.</w:t>
       </w:r>
     </w:p>
     <w:p>
@@ -3646,15 +3430,7 @@
         <w:spacing w:line="276" w:lineRule="auto"/>
       </w:pPr>
       <w:r>
-        <w:t xml:space="preserve">The questionnaire results clearly show that customers are experiencing real problems with the current system at </w:t>
-      </w:r>
-      <w:proofErr w:type="spellStart"/>
-      <w:r>
-        <w:t>Filmtopia</w:t>
-      </w:r>
-      <w:proofErr w:type="spellEnd"/>
-      <w:r>
-        <w:t>. The most significant issues are long queues at the box office, errors with seat allocation and the inability to book tickets through the kiosk. The results also show strong demand for a self-service ticketing kiosk, graphical seat selection and combined food and drink ordering. These findings have directly informed the objectives set out later in this investigation.</w:t>
+        <w:t>The questionnaire results clearly show that customers are experiencing real problems with the current system at Filmtopia. The most significant issues are long queues at the box office, errors with seat allocation and the inability to book tickets through the kiosk. The results also show strong demand for a self-service ticketing kiosk, graphical seat selection and combined food and drink ordering. These findings have directly informed the objectives set out later in this investigation.</w:t>
       </w:r>
     </w:p>
     <w:p>
@@ -3680,15 +3456,7 @@
         <w:spacing w:line="276" w:lineRule="auto"/>
       </w:pPr>
       <w:r>
-        <w:t xml:space="preserve">As part of the investigation I visited </w:t>
-      </w:r>
-      <w:proofErr w:type="spellStart"/>
-      <w:r>
-        <w:t>Filmtopia</w:t>
-      </w:r>
-      <w:proofErr w:type="spellEnd"/>
-      <w:r>
-        <w:t xml:space="preserve"> during an evening showing to observe how the current system operates in practice. Rather than asking questions or interrupting the workflow I simply watched how staff handled customers during the pre-screening period when the cinema was at its busiest. The aim was to see the existing system in action and to identify any problems that might not have come up during the interviews or questionnaire.</w:t>
+        <w:t>As part of the investigation I visited Filmtopia during an evening showing to observe how the current system operates in practice. Rather than asking questions or interrupting the workflow I simply watched how staff handled customers during the pre-screening period when the cinema was at its busiest. The aim was to see the existing system in action and to identify any problems that might not have come up during the interviews or questionnaire.</w:t>
       </w:r>
     </w:p>
     <w:p>
@@ -4120,7 +3888,6 @@
           <w:szCs w:val="22"/>
         </w:rPr>
       </w:pPr>
-      <w:proofErr w:type="spellStart"/>
       <w:r>
         <w:rPr>
           <w:rFonts w:ascii="Aptos" w:eastAsia="Aptos" w:hAnsi="Aptos" w:cs="Aptos"/>
@@ -4130,19 +3897,7 @@
           <w:sz w:val="22"/>
           <w:szCs w:val="22"/>
         </w:rPr>
-        <w:t>Filmtopia</w:t>
-      </w:r>
-      <w:proofErr w:type="spellEnd"/>
-      <w:r>
-        <w:rPr>
-          <w:rFonts w:ascii="Aptos" w:eastAsia="Aptos" w:hAnsi="Aptos" w:cs="Aptos"/>
-          <w:b/>
-          <w:bCs/>
-          <w:color w:val="A02B93"/>
-          <w:sz w:val="22"/>
-          <w:szCs w:val="22"/>
-        </w:rPr>
-        <w:t xml:space="preserve"> ticket stub:</w:t>
+        <w:t>Filmtopia ticket stub:</w:t>
       </w:r>
     </w:p>
     <w:p>
@@ -4357,15 +4112,7 @@
       </w:r>
       <w:r>
         <w:lastRenderedPageBreak/>
-        <w:t xml:space="preserve">simultaneously. This is a clean and intuitive way of presenting information that allows customers to find what they want quickly without having to navigate through multiple pages. For the </w:t>
-      </w:r>
-      <w:proofErr w:type="spellStart"/>
-      <w:r>
-        <w:t>Filmtopia</w:t>
-      </w:r>
-      <w:proofErr w:type="spellEnd"/>
-      <w:r>
-        <w:t xml:space="preserve"> system I will incorporate a similar visual approach to displaying films on the customer kiosk, ensuring that screenings are easy to browse and select.</w:t>
+        <w:t>simultaneously. This is a clean and intuitive way of presenting information that allows customers to find what they want quickly without having to navigate through multiple pages. For the Filmtopia system I will incorporate a similar visual approach to displaying films on the customer kiosk, ensuring that screenings are easy to browse and select.</w:t>
       </w:r>
     </w:p>
     <w:p>
@@ -4489,15 +4236,7 @@
       </w:r>
       <w:r>
         <w:lastRenderedPageBreak/>
-        <w:t xml:space="preserve">and wheelchair access is also clearly displayed. This level of detail is something I aim to replicate in </w:t>
-      </w:r>
-      <w:proofErr w:type="spellStart"/>
-      <w:r>
-        <w:t>Filmtopia</w:t>
-      </w:r>
-      <w:proofErr w:type="spellEnd"/>
-      <w:r>
-        <w:t>, where staff and customers should be able to see all relevant information about a screening at a glance without having to search through multiple menus.</w:t>
+        <w:t>and wheelchair access is also clearly displayed. This level of detail is something I aim to replicate in Filmtopia, where staff and customers should be able to see all relevant information about a screening at a glance without having to search through multiple menus.</w:t>
       </w:r>
     </w:p>
     <w:p>
@@ -4617,15 +4356,7 @@
         <w:spacing w:line="276" w:lineRule="auto"/>
       </w:pPr>
       <w:r>
-        <w:t xml:space="preserve">Vue's seat selection interface is a standout feature of their system. It displays a graphical layout of the screen showing every seat as a coloured icon, with different colours representing different seat types and prices. VIP seats are shown in orange at £8.49, Regular seats in black at £7.49, Saver seats in green at £6.49 and Super Saver seats in red at £4.99. Occupied seats are shown in grey so customers can immediately see what is available. Rows are labelled alphabetically on the left hand side. This graphical seat selection is a key feature I plan to implement in </w:t>
-      </w:r>
-      <w:proofErr w:type="spellStart"/>
-      <w:r>
-        <w:t>Filmtopia</w:t>
-      </w:r>
-      <w:proofErr w:type="spellEnd"/>
-      <w:r>
-        <w:t xml:space="preserve"> as it directly addresses the double booking problem identified in the interviews. By showing customers and staff exactly which seats are taken in real time the system eliminates the risk of two people being assigned the same seat.</w:t>
+        <w:t>Vue's seat selection interface is a standout feature of their system. It displays a graphical layout of the screen showing every seat as a coloured icon, with different colours representing different seat types and prices. VIP seats are shown in orange at £8.49, Regular seats in black at £7.49, Saver seats in green at £6.49 and Super Saver seats in red at £4.99. Occupied seats are shown in grey so customers can immediately see what is available. Rows are labelled alphabetically on the left hand side. This graphical seat selection is a key feature I plan to implement in Filmtopia as it directly addresses the double booking problem identified in the interviews. By showing customers and staff exactly which seats are taken in real time the system eliminates the risk of two people being assigned the same seat.</w:t>
       </w:r>
     </w:p>
     <w:p>
@@ -4637,17 +4368,8 @@
           <w:b/>
           <w:bCs/>
         </w:rPr>
-        <w:t xml:space="preserve">Features Identified for </w:t>
-      </w:r>
-      <w:proofErr w:type="spellStart"/>
-      <w:r>
-        <w:rPr>
-          <w:b/>
-          <w:bCs/>
-        </w:rPr>
-        <w:t>Filmtopia</w:t>
-      </w:r>
-      <w:proofErr w:type="spellEnd"/>
+        <w:t>Features Identified for Filmtopia</w:t>
+      </w:r>
     </w:p>
     <w:p>
       <w:pPr>
@@ -4747,15 +4469,7 @@
         <w:spacing w:line="276" w:lineRule="auto"/>
       </w:pPr>
       <w:r>
-        <w:t xml:space="preserve">The second system I researched was Odeon, which is the largest cinema chain in the UK. Odeon operates over 120 cinemas across the UK and Ireland and their online booking system offered several useful features to compare against Vue and to inform the design of </w:t>
-      </w:r>
-      <w:proofErr w:type="spellStart"/>
-      <w:r>
-        <w:t>Filmtopia</w:t>
-      </w:r>
-      <w:proofErr w:type="spellEnd"/>
-      <w:r>
-        <w:t>.</w:t>
+        <w:t>The second system I researched was Odeon, which is the largest cinema chain in the UK. Odeon operates over 120 cinemas across the UK and Ireland and their online booking system offered several useful features to compare against Vue and to inform the design of Filmtopia.</w:t>
       </w:r>
     </w:p>
     <w:p>
@@ -4879,15 +4593,7 @@
         <w:spacing w:line="276" w:lineRule="auto"/>
       </w:pPr>
       <w:r>
-        <w:t xml:space="preserve">Similar to Vue, Odeon presents films using large poster images organised under a Top Films heading. However Odeon includes additional information directly on the film page such as the director, cast, runtime, release date and genre tags. This richer level of detail gives customers more context before making a booking decision. Odeon also includes a quick search bar at the bottom of the page allowing users to filter by cinema, film, date and time. One notable difference from Vue is that Odeon uses a darker navy blue colour scheme throughout which creates a more premium feel. For </w:t>
-      </w:r>
-      <w:proofErr w:type="spellStart"/>
-      <w:r>
-        <w:t>Filmtopia</w:t>
-      </w:r>
-      <w:proofErr w:type="spellEnd"/>
-      <w:r>
-        <w:t xml:space="preserve"> I will aim to display key film </w:t>
+        <w:t xml:space="preserve">Similar to Vue, Odeon presents films using large poster images organised under a Top Films heading. However Odeon includes additional information directly on the film page such as the director, cast, runtime, release date and genre tags. This richer level of detail gives customers more context before making a booking decision. Odeon also includes a quick search bar at the bottom of the page allowing users to filter by cinema, film, date and time. One notable difference from Vue is that Odeon uses a darker navy blue colour scheme throughout which creates a more premium feel. For Filmtopia I will aim to display key film </w:t>
       </w:r>
       <w:r>
         <w:lastRenderedPageBreak/>
@@ -5009,15 +4715,7 @@
       </w:r>
       <w:r>
         <w:lastRenderedPageBreak/>
-        <w:t xml:space="preserve">time, screen number and format such as 3D. A Book Now button is displayed prominently on each card making the next action immediately obvious. This clear layout is something I will replicate in </w:t>
-      </w:r>
-      <w:proofErr w:type="spellStart"/>
-      <w:r>
-        <w:t>Filmtopia</w:t>
-      </w:r>
-      <w:proofErr w:type="spellEnd"/>
-      <w:r>
-        <w:t xml:space="preserve"> where staff should be able to see all screenings for a given film at a glance.</w:t>
+        <w:t>time, screen number and format such as 3D. A Book Now button is displayed prominently on each card making the next action immediately obvious. This clear layout is something I will replicate in Filmtopia where staff should be able to see all screenings for a given film at a glance.</w:t>
       </w:r>
     </w:p>
     <w:p>
@@ -5131,27 +4829,11 @@
         <w:spacing w:line="276" w:lineRule="auto"/>
       </w:pPr>
       <w:r>
-        <w:t xml:space="preserve">Odeon's seat selection screen is particularly well designed and shows several features worth incorporating into </w:t>
-      </w:r>
-      <w:proofErr w:type="spellStart"/>
-      <w:r>
-        <w:t>Filmtopia</w:t>
-      </w:r>
-      <w:proofErr w:type="spellEnd"/>
-      <w:r>
-        <w:t xml:space="preserve">. The screen displays a graphical layout of the entire auditorium with seats colour coded by type and price. Green seats represent Classic Saver at £14.99, cream seats represent Classic at £16.49 and orange seats represent Classic Popular at £17.99. Unavailable seats are shown with an X so it is immediately clear which seats cannot be booked. A seat key at the bottom explains the colour coding including wheelchair and companion seat options. The booking process is also clearly structured </w:t>
+        <w:t xml:space="preserve">Odeon's seat selection screen is particularly well designed and shows several features worth incorporating into Filmtopia. The screen displays a graphical layout of the entire auditorium with seats colour coded by type and price. Green seats represent Classic Saver at £14.99, cream seats represent Classic at £16.49 and orange seats represent Classic Popular at £17.99. Unavailable seats are shown with an X so it is immediately clear which seats cannot be booked. A seat key at the bottom explains the colour coding including wheelchair and companion seat options. The booking process is also clearly structured </w:t>
       </w:r>
       <w:r>
         <w:lastRenderedPageBreak/>
-        <w:t xml:space="preserve">using a step by step tab navigation at the top showing Seats, Sign In, Tickets, Food, Summary and Payment. This staged approach guides the user through the process logically and reduces confusion. For </w:t>
-      </w:r>
-      <w:proofErr w:type="spellStart"/>
-      <w:r>
-        <w:t>Filmtopia</w:t>
-      </w:r>
-      <w:proofErr w:type="spellEnd"/>
-      <w:r>
-        <w:t xml:space="preserve"> I will incorporate a similar colour coded seat map and a clear step by step flow for the customer kiosk booking process.</w:t>
+        <w:t>using a step by step tab navigation at the top showing Seats, Sign In, Tickets, Food, Summary and Payment. This staged approach guides the user through the process logically and reduces confusion. For Filmtopia I will incorporate a similar colour coded seat map and a clear step by step flow for the customer kiosk booking process.</w:t>
       </w:r>
     </w:p>
     <w:p>
@@ -5163,17 +4845,8 @@
           <w:b/>
           <w:bCs/>
         </w:rPr>
-        <w:t xml:space="preserve">Features Identified for </w:t>
-      </w:r>
-      <w:proofErr w:type="spellStart"/>
-      <w:r>
-        <w:rPr>
-          <w:b/>
-          <w:bCs/>
-        </w:rPr>
-        <w:t>Filmtopia</w:t>
-      </w:r>
-      <w:proofErr w:type="spellEnd"/>
+        <w:t>Features Identified for Filmtopia</w:t>
+      </w:r>
     </w:p>
     <w:p>
       <w:pPr>
@@ -9367,15 +9040,7 @@
         <w:spacing w:line="276" w:lineRule="auto"/>
       </w:pPr>
       <w:r>
-        <w:t xml:space="preserve">The existing system at </w:t>
-      </w:r>
-      <w:proofErr w:type="spellStart"/>
-      <w:r>
-        <w:t>Filmtopia</w:t>
-      </w:r>
-      <w:proofErr w:type="spellEnd"/>
-      <w:r>
-        <w:t xml:space="preserve"> receives several types of input, all of which are entered manually by staff or the manager. When a customer arrives to book tickets a member of staff writes the customer's name, chosen film, screening time, number of tickets and preferred seats into a paper booking diary. There is no digital record of this at the point of entry meaning the accuracy of the data depends entirely on the staff member's handwriting and attention to detail.</w:t>
+        <w:t>The existing system at Filmtopia receives several types of input, all of which are entered manually by staff or the manager. When a customer arrives to book tickets a member of staff writes the customer's name, chosen film, screening time, number of tickets and preferred seats into a paper booking diary. There is no digital record of this at the point of entry meaning the accuracy of the data depends entirely on the staff member's handwriting and attention to detail.</w:t>
       </w:r>
     </w:p>
     <w:p>
@@ -9582,13 +9247,8 @@
       <w:pPr>
         <w:spacing w:line="276" w:lineRule="auto"/>
       </w:pPr>
-      <w:proofErr w:type="spellStart"/>
-      <w:r>
-        <w:t>Filmtopia</w:t>
-      </w:r>
-      <w:proofErr w:type="spellEnd"/>
-      <w:r>
-        <w:t xml:space="preserve"> is a small independent cinema that is currently managing all of its operations using a combination of paper records and disconnected spreadsheets. This approach may have been adequate when the cinema first opened but it has become increasingly problematic as the demands on the system have grown. The core problem is that the existing system is unreliable, slow and disconnected, and this is having a direct negative impact on both staff and customers.</w:t>
+      <w:r>
+        <w:t>Filmtopia is a small independent cinema that is currently managing all of its operations using a combination of paper records and disconnected spreadsheets. This approach may have been adequate when the cinema first opened but it has become increasingly problematic as the demands on the system have grown. The core problem is that the existing system is unreliable, slow and disconnected, and this is having a direct negative impact on both staff and customers.</w:t>
       </w:r>
     </w:p>
     <w:p>
@@ -9596,15 +9256,7 @@
         <w:spacing w:line="276" w:lineRule="auto"/>
       </w:pPr>
       <w:r>
-        <w:t xml:space="preserve">The most critical issue identified through the investigation is the risk of double bookings. Because seat allocations are recorded manually in a paper diary with no real time updating, two members of staff can independently assign the same seat to different customers for the same screening without either being aware of it. This was confirmed by both members of staff interviewed and by 65% of customers in the questionnaire who reported having experienced a problem when booking at </w:t>
-      </w:r>
-      <w:proofErr w:type="spellStart"/>
-      <w:r>
-        <w:t>Filmtopia</w:t>
-      </w:r>
-      <w:proofErr w:type="spellEnd"/>
-      <w:r>
-        <w:t>. It was also directly observed during the site visit. This is not an occasional or minor issue but a fundamental flaw in how the existing system manages booking data. A relational database with referential integrity enforced between the relevant tables will directly address this by ensuring that once a seat is recorded as booked for a particular screening it cannot be booked again. This is dealt with by Objective 2 in the next section and supported by Objective 3, which covers the graphical seat map that makes taken seats visible at a glance.</w:t>
+        <w:t>The most critical issue identified through the investigation is the risk of double bookings. Because seat allocations are recorded manually in a paper diary with no real time updating, two members of staff can independently assign the same seat to different customers for the same screening without either being aware of it. This was confirmed by both members of staff interviewed and by 65% of customers in the questionnaire who reported having experienced a problem when booking at Filmtopia. It was also directly observed during the site visit. This is not an occasional or minor issue but a fundamental flaw in how the existing system manages booking data. A relational database with referential integrity enforced between the relevant tables will directly address this by ensuring that once a seat is recorded as booked for a particular screening it cannot be booked again. This is dealt with by Objective 2 in the next section and supported by Objective 3, which covers the graphical seat map that makes taken seats visible at a glance.</w:t>
       </w:r>
     </w:p>
     <w:p>
@@ -9621,15 +9273,7 @@
         <w:spacing w:line="276" w:lineRule="auto"/>
       </w:pPr>
       <w:r>
-        <w:t xml:space="preserve">The third significant problem is the poor customer facing experience. The kiosk currently installed in the cinema can only handle food and drink orders and cannot sell tickets, which forces customers to queue at both the kiosk and the box office. This was raised by multiple customers in the questionnaire and observed directly during the site visit. The proposed solution will address this by providing a customer kiosk interface through which customers can browse films, select a screening, choose their seats and add food and drink items to their order in a single joined up process. This is dealt with by Objective 4, which covers the </w:t>
-      </w:r>
-      <w:proofErr w:type="spellStart"/>
-      <w:r>
-        <w:t>self service</w:t>
-      </w:r>
-      <w:proofErr w:type="spellEnd"/>
-      <w:r>
-        <w:t xml:space="preserve"> kiosk, and Objective 5, which covers adding food and drink to a booking.</w:t>
+        <w:t>The third significant problem is the poor customer facing experience. The kiosk currently installed in the cinema can only handle food and drink orders and cannot sell tickets, which forces customers to queue at both the kiosk and the box office. This was raised by multiple customers in the questionnaire and observed directly during the site visit. The proposed solution will address this by providing a customer kiosk interface through which customers can browse films, select a screening, choose their seats and add food and drink items to their order in a single joined up process. This is dealt with by Objective 4, which covers the self service kiosk, and Objective 5, which covers adding food and drink to a booking.</w:t>
       </w:r>
     </w:p>
     <w:p>
@@ -9663,15 +9307,7 @@
         <w:spacing w:line="276" w:lineRule="auto"/>
       </w:pPr>
       <w:r>
-        <w:t xml:space="preserve">Functional requirements are the specific things the system must be able to do. For </w:t>
-      </w:r>
-      <w:proofErr w:type="spellStart"/>
-      <w:r>
-        <w:t>Filmtopia</w:t>
-      </w:r>
-      <w:proofErr w:type="spellEnd"/>
-      <w:r>
-        <w:t xml:space="preserve"> these include the ability to add and manage films and screenings (Objectives 6 and 7), to display a graphical seat map showing which seats are available and which are already booked (Objective 3), to process customer bookings and link them to specific seats and screenings (Objectives 1 and 2), to allow food and drink orders to be added to a booking (Objective 5) and to generate sales reports for the manager (Objective 8). These requirements map directly to the objectives set out later in this investigation.</w:t>
+        <w:t>Functional requirements are the specific things the system must be able to do. For Filmtopia these include the ability to add and manage films and screenings (Objectives 6 and 7), to display a graphical seat map showing which seats are available and which are already booked (Objective 3), to process customer bookings and link them to specific seats and screenings (Objectives 1 and 2), to allow food and drink orders to be added to a booking (Objective 5) and to generate sales reports for the manager (Objective 8). These requirements map directly to the objectives set out later in this investigation.</w:t>
       </w:r>
     </w:p>
     <w:p>
@@ -9679,15 +9315,7 @@
         <w:spacing w:line="276" w:lineRule="auto"/>
       </w:pPr>
       <w:r>
-        <w:t xml:space="preserve">Non-functional requirements are the qualities the system must have rather than the specific things it must do. For </w:t>
-      </w:r>
-      <w:proofErr w:type="spellStart"/>
-      <w:r>
-        <w:t>Filmtopia</w:t>
-      </w:r>
-      <w:proofErr w:type="spellEnd"/>
-      <w:r>
-        <w:t xml:space="preserve"> the most important non-functional requirements are reliability, usability and data integrity. The system must be reliable enough to be used continuously during opening hours without crashing or producing errors. It must be usable by staff with varying levels of technical confidence without extensive training, which is reflected in Objectives 14 and 15. And it must maintain data integrity at all times, meaning </w:t>
+        <w:t xml:space="preserve">Non-functional requirements are the qualities the system must have rather than the specific things it must do. For Filmtopia the most important non-functional requirements are reliability, usability and data integrity. The system must be reliable enough to be used continuously during opening hours without crashing or producing errors. It must be usable by staff with varying levels of technical confidence without extensive training, which is reflected in Objectives 14 and 15. And it must maintain data integrity at all times, meaning </w:t>
       </w:r>
       <w:r>
         <w:lastRenderedPageBreak/>
@@ -9717,31 +9345,7 @@
         <w:spacing w:line="276" w:lineRule="auto"/>
       </w:pPr>
       <w:r>
-        <w:t xml:space="preserve">The proposed solution is a Visual Basic .NET Windows Forms application built in Visual Studio, using </w:t>
-      </w:r>
-      <w:proofErr w:type="spellStart"/>
-      <w:r>
-        <w:t>OleDb</w:t>
-      </w:r>
-      <w:proofErr w:type="spellEnd"/>
-      <w:r>
-        <w:t xml:space="preserve"> to manage the connection between the application and a Microsoft Access database stored in the Access 2002 to 2003 .</w:t>
-      </w:r>
-      <w:proofErr w:type="spellStart"/>
-      <w:r>
-        <w:t>mdb</w:t>
-      </w:r>
-      <w:proofErr w:type="spellEnd"/>
-      <w:r>
-        <w:t xml:space="preserve"> format. Visual Basic .NET has been chosen because it is the language used throughout this course and it allows the rapid development of graphical Windows applications with a professional user interface. </w:t>
-      </w:r>
-      <w:proofErr w:type="spellStart"/>
-      <w:r>
-        <w:t>OleDb</w:t>
-      </w:r>
-      <w:proofErr w:type="spellEnd"/>
-      <w:r>
-        <w:t xml:space="preserve"> has been chosen as the database connectivity method because it provides a straightforward and reliable way of connecting a Visual Basic .NET application to a Microsoft Access database, allowing SQL queries to be executed directly from the application code to insert, update, delete and retrieve records. Microsoft Access has been chosen as the database because it supports a full relational structure with primary keys, foreign keys and referential integrity which directly addresses the data management problems identified in the investigation.</w:t>
+        <w:t>The proposed solution is a Visual Basic .NET Windows Forms application built in Visual Studio, using OleDb to manage the connection between the application and a Microsoft Access database stored in the Access 2002 to 2003 .mdb format. Visual Basic .NET has been chosen because it is the language used throughout this course and it allows the rapid development of graphical Windows applications with a professional user interface. OleDb has been chosen as the database connectivity method because it provides a straightforward and reliable way of connecting a Visual Basic .NET application to a Microsoft Access database, allowing SQL queries to be executed directly from the application code to insert, update, delete and retrieve records. Microsoft Access has been chosen as the database because it supports a full relational structure with primary keys, foreign keys and referential integrity which directly addresses the data management problems identified in the investigation.</w:t>
       </w:r>
     </w:p>
     <w:p>
@@ -9749,15 +9353,7 @@
         <w:spacing w:line="276" w:lineRule="auto"/>
       </w:pPr>
       <w:r>
-        <w:t xml:space="preserve">The system will support three distinct user types each with their own interface and access level. Customers will access the system through a </w:t>
-      </w:r>
-      <w:proofErr w:type="spellStart"/>
-      <w:r>
-        <w:t>self service</w:t>
-      </w:r>
-      <w:proofErr w:type="spellEnd"/>
-      <w:r>
-        <w:t xml:space="preserve"> kiosk interface. Staff will be able to log in to manage bookings and screenings. The manager will have full access to all areas of the system including film management and sales reporting. Access levels will be enforced through the login system to ensure that users can only access the parts of the system that are relevant to their role, which is dealt with by Objective 10.</w:t>
+        <w:t>The system will support three distinct user types each with their own interface and access level. Customers will access the system through a self service kiosk interface. Staff will be able to log in to manage bookings and screenings. The manager will have full access to all areas of the system including film management and sales reporting. Access levels will be enforced through the login system to ensure that users can only access the parts of the system that are relevant to their role, which is dealt with by Objective 10.</w:t>
       </w:r>
     </w:p>
     <w:p>
@@ -9791,15 +9387,7 @@
         <w:spacing w:line="276" w:lineRule="auto"/>
       </w:pPr>
       <w:r>
-        <w:t xml:space="preserve">Whilst the proposed </w:t>
-      </w:r>
-      <w:proofErr w:type="spellStart"/>
-      <w:r>
-        <w:t>Filmtopia</w:t>
-      </w:r>
-      <w:proofErr w:type="spellEnd"/>
-      <w:r>
-        <w:t xml:space="preserve"> system will address the core problems identified in the investigation, there are several areas that will not be included in the solution due to constraints of time, scope and available hardware and software. These limitations are outlined below.</w:t>
+        <w:t>Whilst the proposed Filmtopia system will address the core problems identified in the investigation, there are several areas that will not be included in the solution due to constraints of time, scope and available hardware and software. These limitations are outlined below.</w:t>
       </w:r>
     </w:p>
     <w:p>
@@ -9835,23 +9423,7 @@
         <w:spacing w:line="276" w:lineRule="auto"/>
       </w:pPr>
       <w:r>
-        <w:t xml:space="preserve">The system will not support multiple simultaneous users over a network. Whilst </w:t>
-      </w:r>
-      <w:proofErr w:type="spellStart"/>
-      <w:r>
-        <w:t>OleDb</w:t>
-      </w:r>
-      <w:proofErr w:type="spellEnd"/>
-      <w:r>
-        <w:t xml:space="preserve"> connections to a Microsoft Access database can technically support multiple users, developing a fully networked multi-user system with appropriate concurrency controls and conflict resolution is beyond the scope of this project. The system will be designed for use on a single machine or a small number of machines accessing the same .</w:t>
-      </w:r>
-      <w:proofErr w:type="spellStart"/>
-      <w:r>
-        <w:t>mdb</w:t>
-      </w:r>
-      <w:proofErr w:type="spellEnd"/>
-      <w:r>
-        <w:t xml:space="preserve"> database file locally.</w:t>
+        <w:t>The system will not support multiple simultaneous users over a network. Whilst OleDb connections to a Microsoft Access database can technically support multiple users, developing a fully networked multi-user system with appropriate concurrency controls and conflict resolution is beyond the scope of this project. The system will be designed for use on a single machine or a small number of machines accessing the same .mdb database file locally.</w:t>
       </w:r>
     </w:p>
     <w:p>
@@ -10084,7 +9656,35 @@
           <w:b/>
           <w:bCs/>
         </w:rPr>
-        <w:t>: The system must allow customers to add food and drink items to their order at the same time as booking tickets, with the combined order saved to the database.</w:t>
+        <w:t>: The system must allow customers</w:t>
+      </w:r>
+      <w:r>
+        <w:rPr>
+          <w:b/>
+          <w:bCs/>
+        </w:rPr>
+        <w:t>/staff</w:t>
+      </w:r>
+      <w:r>
+        <w:rPr>
+          <w:b/>
+          <w:bCs/>
+        </w:rPr>
+        <w:t xml:space="preserve"> to add food and drink items to </w:t>
+      </w:r>
+      <w:r>
+        <w:rPr>
+          <w:b/>
+          <w:bCs/>
+        </w:rPr>
+        <w:t>an</w:t>
+      </w:r>
+      <w:r>
+        <w:rPr>
+          <w:b/>
+          <w:bCs/>
+        </w:rPr>
+        <w:t xml:space="preserve"> order at the same time as booking tickets, with the combined order saved to the database.</w:t>
       </w:r>
     </w:p>
     <w:p>
@@ -10223,15 +9823,7 @@
         <w:t xml:space="preserve">Success Criteria: </w:t>
       </w:r>
       <w:r>
-        <w:t xml:space="preserve">The report should be generated using an SQL query through the </w:t>
-      </w:r>
-      <w:proofErr w:type="spellStart"/>
-      <w:r>
-        <w:t>OleDb</w:t>
-      </w:r>
-      <w:proofErr w:type="spellEnd"/>
-      <w:r>
-        <w:t xml:space="preserve"> connection and displayed on screen within 5 seconds of the date range being selected. The report should show the correct total number of tickets sold and total revenue for the selected period, calculated directly from the bookings in the database.</w:t>
+        <w:t>The report should be generated using an SQL query through the OleDb connection and displayed on screen within 5 seconds of the date range being selected. The report should show the correct total number of tickets sold and total revenue for the selected period, calculated directly from the bookings in the database.</w:t>
       </w:r>
     </w:p>
     <w:p>
@@ -10482,15 +10074,7 @@
         <w:t xml:space="preserve">Success Criteria: </w:t>
       </w:r>
       <w:r>
-        <w:t xml:space="preserve">All forms should use the same colour scheme, font and button placement. Navigation buttons should appear in consistent positions across all forms. The system should look professional and be immediately recognisable as a </w:t>
-      </w:r>
-      <w:proofErr w:type="spellStart"/>
-      <w:r>
-        <w:t>Filmtopia</w:t>
-      </w:r>
-      <w:proofErr w:type="spellEnd"/>
-      <w:r>
-        <w:t xml:space="preserve"> branded application.</w:t>
+        <w:t>All forms should use the same colour scheme, font and button placement. Navigation buttons should appear in consistent positions across all forms. The system should look professional and be immediately recognisable as a Filmtopia branded application.</w:t>
       </w:r>
     </w:p>
     <w:p>
@@ -10650,15 +10234,7 @@
         <w:t>Success Criteria:</w:t>
       </w:r>
       <w:r>
-        <w:t xml:space="preserve"> Every booking created, cancelled or amended should generate a log entry showing the username of the staff member responsible along with the date and time of the action. The audit log should be viewable by the manager but should not be editable or </w:t>
-      </w:r>
-      <w:proofErr w:type="spellStart"/>
-      <w:r>
-        <w:t>deletable</w:t>
-      </w:r>
-      <w:proofErr w:type="spellEnd"/>
-      <w:r>
-        <w:t xml:space="preserve"> by staff. The log should accurately reflect every relevant action carried out in the system during normal operation.</w:t>
+        <w:t xml:space="preserve"> Every booking created, cancelled or amended should generate a log entry showing the username of the staff member responsible along with the date and time of the action. The audit log should be viewable by the manager but should not be editable or deletable by staff. The log should accurately reflect every relevant action carried out in the system during normal operation.</w:t>
       </w:r>
     </w:p>
     <w:p>
@@ -10736,27 +10312,7 @@
           <w:color w:val="EE0000"/>
           <w:highlight w:val="yellow"/>
         </w:rPr>
-        <w:t xml:space="preserve">The eighteen objectives above were written before any of </w:t>
-      </w:r>
-      <w:proofErr w:type="spellStart"/>
-      <w:r>
-        <w:rPr>
-          <w:b/>
-          <w:bCs/>
-          <w:color w:val="EE0000"/>
-          <w:highlight w:val="yellow"/>
-        </w:rPr>
-        <w:t>Filmtopia</w:t>
-      </w:r>
-      <w:proofErr w:type="spellEnd"/>
-      <w:r>
-        <w:rPr>
-          <w:b/>
-          <w:bCs/>
-          <w:color w:val="EE0000"/>
-          <w:highlight w:val="yellow"/>
-        </w:rPr>
-        <w:t xml:space="preserve"> existed, and building the prototype showed that they did not cover the whole problem. Some of the gaps came out of the feedback sessions, some came out of using the prototype myself for a few weeks, and a few came out of faults that only appeared once there was real data in the database. Rather than quietly widen the original objectives so that whatever I happened to build would satisfy them, which would make the evaluation worthless, I have written the additional requirements down as a second set of objectives with their own success criteria. Everything from Objective 19 onwards was identified after the prototype was finished, and none of it was part of the prototype build.</w:t>
+        <w:t>The eighteen objectives above were written before any of Filmtopia existed, and building the prototype showed that they did not cover the whole problem. Some of the gaps came out of the feedback sessions, some came out of using the prototype myself for a few weeks, and a few came out of faults that only appeared once there was real data in the database. Rather than quietly widen the original objectives so that whatever I happened to build would satisfy them, which would make the evaluation worthless, I have written the additional requirements down as a second set of objectives with their own success criteria. Everything from Objective 19 onwards was identified after the prototype was finished, and none of it was part of the prototype build.</w:t>
       </w:r>
     </w:p>
     <w:p>
@@ -10768,6 +10324,49 @@
           <w:bCs/>
         </w:rPr>
       </w:pPr>
+    </w:p>
+    <w:p>
+      <w:pPr>
+        <w:spacing w:after="80" w:line="276" w:lineRule="auto"/>
+        <w:jc w:val="both"/>
+        <w:rPr>
+          <w:b/>
+          <w:bCs/>
+        </w:rPr>
+      </w:pPr>
+    </w:p>
+    <w:p>
+      <w:pPr>
+        <w:spacing w:after="80" w:line="276" w:lineRule="auto"/>
+        <w:jc w:val="both"/>
+        <w:rPr>
+          <w:b/>
+          <w:bCs/>
+        </w:rPr>
+      </w:pPr>
+      <w:r>
+        <w:rPr>
+          <w:b/>
+          <w:bCs/>
+        </w:rPr>
+        <w:t xml:space="preserve">Objective 19: The system must support more than one type of seat within a screen, with each type carrying its own price multiplier so that a premium seat costs more than a standard seat for the same screening.</w:t>
+      </w:r>
+    </w:p>
+    <w:p>
+      <w:pPr>
+        <w:spacing w:after="80" w:line="276" w:lineRule="auto"/>
+        <w:jc w:val="both"/>
+      </w:pPr>
+      <w:r>
+        <w:rPr>
+          <w:b/>
+          <w:bCs/>
+        </w:rPr>
+        <w:t>Success Criteria:</w:t>
+      </w:r>
+      <w:r>
+        <w:t xml:space="preserve"> Seat types should be stored in the database with a multiplier against each one rather than being fixed in the program code, so that the price of a type can be changed without the system being rebuilt. The price of an individual seat should be calculated as the screening ticket price multiplied by the multiplier for that seat's type. Booking three seats of mixed types should produce a total that matches the sum of the individual seat prices to the penny, and the same total should appear on the booking screen, in the stored booking record and on the sales report.</w:t>
+      </w:r>
     </w:p>
     <w:sectPr>
       <w:headerReference w:type="even" r:id="rId23"/>

</xml_diff>

<commit_message>
added objective 20 to the investigation doc
</commit_message>
<xml_diff>
--- a/Investigation.docx
+++ b/Investigation.docx
@@ -10368,6 +10368,39 @@
         <w:t xml:space="preserve"> Seat types should be stored in the database with a multiplier against each one rather than being fixed in the program code, so that the price of a type can be changed without the system being rebuilt. The price of an individual seat should be calculated as the screening ticket price multiplied by the multiplier for that seat's type. Booking three seats of mixed types should produce a total that matches the sum of the individual seat prices to the penny, and the same total should appear on the booking screen, in the stored booking record and on the sales report.</w:t>
       </w:r>
     </w:p>
+    <w:p>
+      <w:pPr>
+        <w:spacing w:after="80" w:line="276" w:lineRule="auto"/>
+        <w:jc w:val="both"/>
+        <w:rPr>
+          <w:b/>
+          <w:bCs/>
+        </w:rPr>
+      </w:pPr>
+      <w:r>
+        <w:rPr>
+          <w:b/>
+          <w:bCs/>
+        </w:rPr>
+        <w:t xml:space="preserve">Objective 20: The system must allow a manager to decide which individual seats in a screen are premium, standard or accessible, rather than the layout being fixed by the program.</w:t>
+      </w:r>
+    </w:p>
+    <w:p>
+      <w:pPr>
+        <w:spacing w:after="80" w:line="276" w:lineRule="auto"/>
+        <w:jc w:val="both"/>
+      </w:pPr>
+      <w:r>
+        <w:rPr>
+          <w:b/>
+          <w:bCs/>
+        </w:rPr>
+        <w:t>Success Criteria:</w:t>
+      </w:r>
+      <w:r>
+        <w:t xml:space="preserve"> A manager should be able to open a plan of any screen and change the class of a single seat or a whole row. The plan should show at least three classes distinguishably, and should remain readable when printed in black and white. Saving a plan for a screen that already has bookings against it should change only the class of each seat and must not delete and recreate the seat records, since existing bookings point at them. The system should warn before changing the class of a seat in a screen that is already selling.</w:t>
+      </w:r>
+    </w:p>
     <w:sectPr>
       <w:headerReference w:type="even" r:id="rId23"/>
       <w:headerReference w:type="default" r:id="rId24"/>

</xml_diff>

<commit_message>
added objective 21 to the investigation doc
</commit_message>
<xml_diff>
--- a/Investigation.docx
+++ b/Investigation.docx
@@ -10401,6 +10401,39 @@
         <w:t xml:space="preserve"> A manager should be able to open a plan of any screen and change the class of a single seat or a whole row. The plan should show at least three classes distinguishably, and should remain readable when printed in black and white. Saving a plan for a screen that already has bookings against it should change only the class of each seat and must not delete and recreate the seat records, since existing bookings point at them. The system should warn before changing the class of a seat in a screen that is already selling.</w:t>
       </w:r>
     </w:p>
+    <w:p>
+      <w:pPr>
+        <w:spacing w:after="80" w:line="276" w:lineRule="auto"/>
+        <w:jc w:val="both"/>
+        <w:rPr>
+          <w:b/>
+          <w:bCs/>
+        </w:rPr>
+      </w:pPr>
+      <w:r>
+        <w:rPr>
+          <w:b/>
+          <w:bCs/>
+        </w:rPr>
+        <w:t xml:space="preserve">Objective 21: The system must allow a member of staff to refund part of a booking, handing back individual seats or a quantity of a food item without cancelling the entire sale.</w:t>
+      </w:r>
+    </w:p>
+    <w:p>
+      <w:pPr>
+        <w:spacing w:after="80" w:line="276" w:lineRule="auto"/>
+        <w:jc w:val="both"/>
+      </w:pPr>
+      <w:r>
+        <w:rPr>
+          <w:b/>
+          <w:bCs/>
+        </w:rPr>
+        <w:t>Success Criteria:</w:t>
+      </w:r>
+      <w:r>
+        <w:t xml:space="preserve"> It should be possible to refund one seat out of several and leave the rest of the booking active, and to refund one item out of a quantity of the same item. Every refund should be recorded as its own record with the date, the total handed back, the reason and the member of staff who authorised it, broken down into one line per thing refunded. A refunded seat should return to sale immediately. Refunding everything left on a booking should cancel that booking automatically. Attempting to refund the same seat twice should be refused.</w:t>
+      </w:r>
+    </w:p>
     <w:sectPr>
       <w:headerReference w:type="even" r:id="rId23"/>
       <w:headerReference w:type="default" r:id="rId24"/>

</xml_diff>

<commit_message>
added objective 22 to the investigation doc
</commit_message>
<xml_diff>
--- a/Investigation.docx
+++ b/Investigation.docx
@@ -10434,6 +10434,39 @@
         <w:t xml:space="preserve"> It should be possible to refund one seat out of several and leave the rest of the booking active, and to refund one item out of a quantity of the same item. Every refund should be recorded as its own record with the date, the total handed back, the reason and the member of staff who authorised it, broken down into one line per thing refunded. A refunded seat should return to sale immediately. Refunding everything left on a booking should cancel that booking automatically. Attempting to refund the same seat twice should be refused.</w:t>
       </w:r>
     </w:p>
+    <w:p>
+      <w:pPr>
+        <w:spacing w:after="80" w:line="276" w:lineRule="auto"/>
+        <w:jc w:val="both"/>
+        <w:rPr>
+          <w:b/>
+          <w:bCs/>
+        </w:rPr>
+      </w:pPr>
+      <w:r>
+        <w:rPr>
+          <w:b/>
+          <w:bCs/>
+        </w:rPr>
+        <w:t xml:space="preserve">Objective 22: The system must allow a sale to be taken for food and drink alone, with no screening and no seats attached to it.</w:t>
+      </w:r>
+    </w:p>
+    <w:p>
+      <w:pPr>
+        <w:spacing w:after="80" w:line="276" w:lineRule="auto"/>
+        <w:jc w:val="both"/>
+      </w:pPr>
+      <w:r>
+        <w:rPr>
+          <w:b/>
+          <w:bCs/>
+        </w:rPr>
+        <w:t>Success Criteria:</w:t>
+      </w:r>
+      <w:r>
+        <w:t xml:space="preserve"> A counter sale should complete and save without a screening being selected. The sale should then appear correctly in the booking search, in the sales report and on the main menu takings figure, and must not be silently dropped by any query that reaches a film through the screening. The sales report should return the same concessions total whether it is measured on the booking date or on the screening date.</w:t>
+      </w:r>
+    </w:p>
     <w:sectPr>
       <w:headerReference w:type="even" r:id="rId23"/>
       <w:headerReference w:type="default" r:id="rId24"/>

</xml_diff>

<commit_message>
added objective 23 to the investigation doc
</commit_message>
<xml_diff>
--- a/Investigation.docx
+++ b/Investigation.docx
@@ -10467,6 +10467,39 @@
         <w:t xml:space="preserve"> A counter sale should complete and save without a screening being selected. The sale should then appear correctly in the booking search, in the sales report and on the main menu takings figure, and must not be silently dropped by any query that reaches a film through the screening. The sales report should return the same concessions total whether it is measured on the booking date or on the screening date.</w:t>
       </w:r>
     </w:p>
+    <w:p>
+      <w:pPr>
+        <w:spacing w:after="80" w:line="276" w:lineRule="auto"/>
+        <w:jc w:val="both"/>
+        <w:rPr>
+          <w:b/>
+          <w:bCs/>
+        </w:rPr>
+      </w:pPr>
+      <w:r>
+        <w:rPr>
+          <w:b/>
+          <w:bCs/>
+        </w:rPr>
+        <w:t xml:space="preserve">Objective 23: The system must account for advertising and turnaround time when deciding how long a screening occupies a screen, rather than using the running time of the film alone.</w:t>
+      </w:r>
+    </w:p>
+    <w:p>
+      <w:pPr>
+        <w:spacing w:after="80" w:line="276" w:lineRule="auto"/>
+        <w:jc w:val="both"/>
+      </w:pPr>
+      <w:r>
+        <w:rPr>
+          <w:b/>
+          <w:bCs/>
+        </w:rPr>
+        <w:t>Success Criteria:</w:t>
+      </w:r>
+      <w:r>
+        <w:t xml:space="preserve"> The time a screening occupies a screen should be the advertising allowance plus the film duration plus the turnaround allowance. Two screenings which would overlap once those allowances are included should be refused, and the message should state which existing screening is in the way. The finishing time displayed to the user should match the time the screen actually becomes free. Both allowances should be held as settings rather than being fixed in the code, and should be able to be overridden for an individual screening.</w:t>
+      </w:r>
+    </w:p>
     <w:sectPr>
       <w:headerReference w:type="even" r:id="rId23"/>
       <w:headerReference w:type="default" r:id="rId24"/>

</xml_diff>

<commit_message>
added objective 24 to the investigation doc
</commit_message>
<xml_diff>
--- a/Investigation.docx
+++ b/Investigation.docx
@@ -10500,6 +10500,39 @@
         <w:t xml:space="preserve"> The time a screening occupies a screen should be the advertising allowance plus the film duration plus the turnaround allowance. Two screenings which would overlap once those allowances are included should be refused, and the message should state which existing screening is in the way. The finishing time displayed to the user should match the time the screen actually becomes free. Both allowances should be held as settings rather than being fixed in the code, and should be able to be overridden for an individual screening.</w:t>
       </w:r>
     </w:p>
+    <w:p>
+      <w:pPr>
+        <w:spacing w:after="80" w:line="276" w:lineRule="auto"/>
+        <w:jc w:val="both"/>
+        <w:rPr>
+          <w:b/>
+          <w:bCs/>
+        </w:rPr>
+      </w:pPr>
+      <w:r>
+        <w:rPr>
+          <w:b/>
+          <w:bCs/>
+        </w:rPr>
+        <w:t xml:space="preserve">Objective 24: The system must be able to suggest the next available start time for a film on a chosen screen, rather than only rejecting a time after the user has already entered one.</w:t>
+      </w:r>
+    </w:p>
+    <w:p>
+      <w:pPr>
+        <w:spacing w:after="80" w:line="276" w:lineRule="auto"/>
+        <w:jc w:val="both"/>
+      </w:pPr>
+      <w:r>
+        <w:rPr>
+          <w:b/>
+          <w:bCs/>
+        </w:rPr>
+        <w:t>Success Criteria:</w:t>
+      </w:r>
+      <w:r>
+        <w:t xml:space="preserve"> Requesting a suggested time should return the earliest start on that day at which the film would fit without overlapping anything already scheduled, taking the advertising and turnaround allowances into account. A gap that is exactly large enough should be accepted and a gap one minute too small should be rejected. Where no gap exists before the last permitted start time, the system should say so rather than offering a time that will not work. A screen that is out of service should not be offered at all.</w:t>
+      </w:r>
+    </w:p>
     <w:sectPr>
       <w:headerReference w:type="even" r:id="rId23"/>
       <w:headerReference w:type="default" r:id="rId24"/>

</xml_diff>

<commit_message>
added objective 25 to the investigation doc
</commit_message>
<xml_diff>
--- a/Investigation.docx
+++ b/Investigation.docx
@@ -10533,6 +10533,39 @@
         <w:t xml:space="preserve"> Requesting a suggested time should return the earliest start on that day at which the film would fit without overlapping anything already scheduled, taking the advertising and turnaround allowances into account. A gap that is exactly large enough should be accepted and a gap one minute too small should be rejected. Where no gap exists before the last permitted start time, the system should say so rather than offering a time that will not work. A screen that is out of service should not be offered at all.</w:t>
       </w:r>
     </w:p>
+    <w:p>
+      <w:pPr>
+        <w:spacing w:after="80" w:line="276" w:lineRule="auto"/>
+        <w:jc w:val="both"/>
+        <w:rPr>
+          <w:b/>
+          <w:bCs/>
+        </w:rPr>
+      </w:pPr>
+      <w:r>
+        <w:rPr>
+          <w:b/>
+          <w:bCs/>
+        </w:rPr>
+        <w:t xml:space="preserve">Objective 25: The system must round the start times it generates up to a sensible interval so that scheduled screenings begin on times a cinema would advertise.</w:t>
+      </w:r>
+    </w:p>
+    <w:p>
+      <w:pPr>
+        <w:spacing w:after="80" w:line="276" w:lineRule="auto"/>
+        <w:jc w:val="both"/>
+      </w:pPr>
+      <w:r>
+        <w:rPr>
+          <w:b/>
+          <w:bCs/>
+        </w:rPr>
+        <w:t>Success Criteria:</w:t>
+      </w:r>
+      <w:r>
+        <w:t xml:space="preserve"> Generated start times should be rounded up to an interval held as a setting, and only intervals which divide evenly into an hour should be accepted. The rounding must be applied before the system checks whether the screening fits, so that a gap which is no longer large enough once the time has been rounded is correctly rejected. A time entered by hand should be left exactly as it was typed.</w:t>
+      </w:r>
+    </w:p>
     <w:sectPr>
       <w:headerReference w:type="even" r:id="rId23"/>
       <w:headerReference w:type="default" r:id="rId24"/>

</xml_diff>

<commit_message>
added objective 26 to the investigation doc
</commit_message>
<xml_diff>
--- a/Investigation.docx
+++ b/Investigation.docx
@@ -10566,6 +10566,39 @@
         <w:t xml:space="preserve"> Generated start times should be rounded up to an interval held as a setting, and only intervals which divide evenly into an hour should be accepted. The rounding must be applied before the system checks whether the screening fits, so that a gap which is no longer large enough once the time has been rounded is correctly rejected. A time entered by hand should be left exactly as it was typed.</w:t>
       </w:r>
     </w:p>
+    <w:p>
+      <w:pPr>
+        <w:spacing w:after="80" w:line="276" w:lineRule="auto"/>
+        <w:jc w:val="both"/>
+        <w:rPr>
+          <w:b/>
+          <w:bCs/>
+        </w:rPr>
+      </w:pPr>
+      <w:r>
+        <w:rPr>
+          <w:b/>
+          <w:bCs/>
+        </w:rPr>
+        <w:t xml:space="preserve">Objective 26: The system must allow a film to be scheduled across a range of dates, or repeatedly across a single day, without the user entering each screening individually.</w:t>
+      </w:r>
+    </w:p>
+    <w:p>
+      <w:pPr>
+        <w:spacing w:after="80" w:line="276" w:lineRule="auto"/>
+        <w:jc w:val="both"/>
+      </w:pPr>
+      <w:r>
+        <w:rPr>
+          <w:b/>
+          <w:bCs/>
+        </w:rPr>
+        <w:t>Success Criteria:</w:t>
+      </w:r>
+      <w:r>
+        <w:t xml:space="preserve"> Scheduling a run should create one screening per day across the chosen range, skipping any day where the screen is already occupied and reporting which days were skipped rather than stopping. Filling a day should create as many screenings as genuinely fit around what is already scheduled. In both cases the proposed times should be displayed for confirmation before anything is written, and the whole run should be saved inside a single transaction so that a partially created run is impossible.</w:t>
+      </w:r>
+    </w:p>
     <w:sectPr>
       <w:headerReference w:type="even" r:id="rId23"/>
       <w:headerReference w:type="default" r:id="rId24"/>

</xml_diff>

<commit_message>
added objective 27 to the investigation doc
</commit_message>
<xml_diff>
--- a/Investigation.docx
+++ b/Investigation.docx
@@ -10599,6 +10599,39 @@
         <w:t xml:space="preserve"> Scheduling a run should create one screening per day across the chosen range, skipping any day where the screen is already occupied and reporting which days were skipped rather than stopping. Filling a day should create as many screenings as genuinely fit around what is already scheduled. In both cases the proposed times should be displayed for confirmation before anything is written, and the whole run should be saved inside a single transaction so that a partially created run is impossible.</w:t>
       </w:r>
     </w:p>
+    <w:p>
+      <w:pPr>
+        <w:spacing w:after="80" w:line="276" w:lineRule="auto"/>
+        <w:jc w:val="both"/>
+        <w:rPr>
+          <w:b/>
+          <w:bCs/>
+        </w:rPr>
+      </w:pPr>
+      <w:r>
+        <w:rPr>
+          <w:b/>
+          <w:bCs/>
+        </w:rPr>
+        <w:t xml:space="preserve">Objective 27: The system must allow a screen to be taken out of service and a food or drink item to be withdrawn from sale, in both cases keeping the record and its sales history rather than deleting it.</w:t>
+      </w:r>
+    </w:p>
+    <w:p>
+      <w:pPr>
+        <w:spacing w:after="80" w:line="276" w:lineRule="auto"/>
+        <w:jc w:val="both"/>
+      </w:pPr>
+      <w:r>
+        <w:rPr>
+          <w:b/>
+          <w:bCs/>
+        </w:rPr>
+        <w:t>Success Criteria:</w:t>
+      </w:r>
+      <w:r>
+        <w:t xml:space="preserve"> Marking a screen out of service should require a reason and should be refused while tickets are held for future screenings in it. A screen that is out of service should be refused when scheduling a new screening. A withdrawn menu item should no longer be offered on the till, the booking screen or the kiosk, but bookings that already include it should continue to display and report correctly. In both cases nothing that has previously been sold should disappear from the sales report.</w:t>
+      </w:r>
+    </w:p>
     <w:sectPr>
       <w:headerReference w:type="even" r:id="rId23"/>
       <w:headerReference w:type="default" r:id="rId24"/>

</xml_diff>

<commit_message>
added objective 28 to the investigation doc
</commit_message>
<xml_diff>
--- a/Investigation.docx
+++ b/Investigation.docx
@@ -10632,6 +10632,39 @@
         <w:t xml:space="preserve"> Marking a screen out of service should require a reason and should be refused while tickets are held for future screenings in it. A screen that is out of service should be refused when scheduling a new screening. A withdrawn menu item should no longer be offered on the till, the booking screen or the kiosk, but bookings that already include it should continue to display and report correctly. In both cases nothing that has previously been sold should disappear from the sales report.</w:t>
       </w:r>
     </w:p>
+    <w:p>
+      <w:pPr>
+        <w:spacing w:after="80" w:line="276" w:lineRule="auto"/>
+        <w:jc w:val="both"/>
+        <w:rPr>
+          <w:b/>
+          <w:bCs/>
+        </w:rPr>
+      </w:pPr>
+      <w:r>
+        <w:rPr>
+          <w:b/>
+          <w:bCs/>
+        </w:rPr>
+        <w:t xml:space="preserve">Objective 28: The system must allow the contents of any list or report to be exported to a file that can be opened in a spreadsheet.</w:t>
+      </w:r>
+    </w:p>
+    <w:p>
+      <w:pPr>
+        <w:spacing w:after="80" w:line="276" w:lineRule="auto"/>
+        <w:jc w:val="both"/>
+      </w:pPr>
+      <w:r>
+        <w:rPr>
+          <w:b/>
+          <w:bCs/>
+        </w:rPr>
+        <w:t>Success Criteria:</w:t>
+      </w:r>
+      <w:r>
+        <w:t xml:space="preserve"> Export should be available from the films, customers, screenings, audit log, door list and sales report screens. The exported file should take its column headings from the grid so that a column added later is included automatically. Values containing commas or quotation marks should be written so that the file still opens correctly. Monetary values in the sales report export should be written as numbers a spreadsheet can total rather than as text.</w:t>
+      </w:r>
+    </w:p>
     <w:sectPr>
       <w:headerReference w:type="even" r:id="rId23"/>
       <w:headerReference w:type="default" r:id="rId24"/>

</xml_diff>

<commit_message>
added objective 29 to the investigation doc
</commit_message>
<xml_diff>
--- a/Investigation.docx
+++ b/Investigation.docx
@@ -10665,6 +10665,39 @@
         <w:t xml:space="preserve"> Export should be available from the films, customers, screenings, audit log, door list and sales report screens. The exported file should take its column headings from the grid so that a column added later is included automatically. Values containing commas or quotation marks should be written so that the file still opens correctly. Monetary values in the sales report export should be written as numbers a spreadsheet can total rather than as text.</w:t>
       </w:r>
     </w:p>
+    <w:p>
+      <w:pPr>
+        <w:spacing w:after="80" w:line="276" w:lineRule="auto"/>
+        <w:jc w:val="both"/>
+        <w:rPr>
+          <w:b/>
+          <w:bCs/>
+        </w:rPr>
+      </w:pPr>
+      <w:r>
+        <w:rPr>
+          <w:b/>
+          <w:bCs/>
+        </w:rPr>
+        <w:t xml:space="preserve">Objective 29: The system must allow a user to change their own password from within the program without the database being opened directly.</w:t>
+      </w:r>
+    </w:p>
+    <w:p>
+      <w:pPr>
+        <w:spacing w:after="80" w:line="276" w:lineRule="auto"/>
+        <w:jc w:val="both"/>
+      </w:pPr>
+      <w:r>
+        <w:rPr>
+          <w:b/>
+          <w:bCs/>
+        </w:rPr>
+        <w:t>Success Criteria:</w:t>
+      </w:r>
+      <w:r>
+        <w:t xml:space="preserve"> Changing a password should require the current password to be entered correctly, should require the new password to be typed twice identically, should enforce a minimum length held as a setting, and should refuse a new password identical to the old one. The new password should be stored using the same method as the existing login system. Both successful and failed attempts should be written to the audit log.</w:t>
+      </w:r>
+    </w:p>
     <w:sectPr>
       <w:headerReference w:type="even" r:id="rId23"/>
       <w:headerReference w:type="default" r:id="rId24"/>

</xml_diff>

<commit_message>
added objective 30 to the investigation doc
</commit_message>
<xml_diff>
--- a/Investigation.docx
+++ b/Investigation.docx
@@ -10698,6 +10698,39 @@
         <w:t xml:space="preserve"> Changing a password should require the current password to be entered correctly, should require the new password to be typed twice identically, should enforce a minimum length held as a setting, and should refuse a new password identical to the old one. The new password should be stored using the same method as the existing login system. Both successful and failed attempts should be written to the audit log.</w:t>
       </w:r>
     </w:p>
+    <w:p>
+      <w:pPr>
+        <w:spacing w:after="80" w:line="276" w:lineRule="auto"/>
+        <w:jc w:val="both"/>
+        <w:rPr>
+          <w:b/>
+          <w:bCs/>
+        </w:rPr>
+      </w:pPr>
+      <w:r>
+        <w:rPr>
+          <w:b/>
+          <w:bCs/>
+        </w:rPr>
+        <w:t xml:space="preserve">Objective 30: The system must allow a manager to create a backup copy of the database from within the program, and must prevent a member of staff from doing so.</w:t>
+      </w:r>
+    </w:p>
+    <w:p>
+      <w:pPr>
+        <w:spacing w:after="80" w:line="276" w:lineRule="auto"/>
+        <w:jc w:val="both"/>
+      </w:pPr>
+      <w:r>
+        <w:rPr>
+          <w:b/>
+          <w:bCs/>
+        </w:rPr>
+        <w:t>Success Criteria:</w:t>
+      </w:r>
+      <w:r>
+        <w:t xml:space="preserve"> A manager should be able to choose a destination folder and create a backup, with the file named so that it includes the date and time and therefore cannot overwrite an earlier backup. The backup option should be disabled for a user below manager level, with an explanation shown rather than the option simply disappearing. Every backup should be recorded in the audit log.</w:t>
+      </w:r>
+    </w:p>
     <w:sectPr>
       <w:headerReference w:type="even" r:id="rId23"/>
       <w:headerReference w:type="default" r:id="rId24"/>

</xml_diff>

<commit_message>
added objective 31 to the investigation doc
</commit_message>
<xml_diff>
--- a/Investigation.docx
+++ b/Investigation.docx
@@ -10731,6 +10731,39 @@
         <w:t xml:space="preserve"> A manager should be able to choose a destination folder and create a backup, with the file named so that it includes the date and time and therefore cannot overwrite an earlier backup. The backup option should be disabled for a user below manager level, with an explanation shown rather than the option simply disappearing. Every backup should be recorded in the audit log.</w:t>
       </w:r>
     </w:p>
+    <w:p>
+      <w:pPr>
+        <w:spacing w:after="80" w:line="276" w:lineRule="auto"/>
+        <w:jc w:val="both"/>
+        <w:rPr>
+          <w:b/>
+          <w:bCs/>
+        </w:rPr>
+      </w:pPr>
+      <w:r>
+        <w:rPr>
+          <w:b/>
+          <w:bCs/>
+        </w:rPr>
+        <w:t xml:space="preserve">Objective 31: The system must prevent a customer at the kiosk from leaving kiosk mode and reaching staff functions without re-entering the password of the account that started it.</w:t>
+      </w:r>
+    </w:p>
+    <w:p>
+      <w:pPr>
+        <w:spacing w:after="80" w:line="276" w:lineRule="auto"/>
+        <w:jc w:val="both"/>
+      </w:pPr>
+      <w:r>
+        <w:rPr>
+          <w:b/>
+          <w:bCs/>
+        </w:rPr>
+        <w:t>Success Criteria:</w:t>
+      </w:r>
+      <w:r>
+        <w:t xml:space="preserve"> Exiting kiosk mode should require the password of the logged in account rather than a simple confirmation. The kiosk should return to its opening screen automatically after a period of inactivity held as a setting, discarding any part completed order. No staff or management function should be reachable from the kiosk at any point.</w:t>
+      </w:r>
+    </w:p>
     <w:sectPr>
       <w:headerReference w:type="even" r:id="rId23"/>
       <w:headerReference w:type="default" r:id="rId24"/>

</xml_diff>

<commit_message>
added objective 32 to the investigation doc
</commit_message>
<xml_diff>
--- a/Investigation.docx
+++ b/Investigation.docx
@@ -10764,6 +10764,39 @@
         <w:t xml:space="preserve"> Exiting kiosk mode should require the password of the logged in account rather than a simple confirmation. The kiosk should return to its opening screen automatically after a period of inactivity held as a setting, discarding any part completed order. No staff or management function should be reachable from the kiosk at any point.</w:t>
       </w:r>
     </w:p>
+    <w:p>
+      <w:pPr>
+        <w:spacing w:after="80" w:line="276" w:lineRule="auto"/>
+        <w:jc w:val="both"/>
+        <w:rPr>
+          <w:b/>
+          <w:bCs/>
+        </w:rPr>
+      </w:pPr>
+      <w:r>
+        <w:rPr>
+          <w:b/>
+          <w:bCs/>
+        </w:rPr>
+        <w:t xml:space="preserve">Objective 32: The system must hold its configurable values in the database rather than in the program code, so that a manager can change them without the system being rebuilt.</w:t>
+      </w:r>
+    </w:p>
+    <w:p>
+      <w:pPr>
+        <w:spacing w:after="80" w:line="276" w:lineRule="auto"/>
+        <w:jc w:val="both"/>
+      </w:pPr>
+      <w:r>
+        <w:rPr>
+          <w:b/>
+          <w:bCs/>
+        </w:rPr>
+        <w:t>Success Criteria:</w:t>
+      </w:r>
+      <w:r>
+        <w:t xml:space="preserve"> Values including the advertising and turnaround allowances, the opening and closing times, the rounding interval, the default ticket price, the maximum seats per sale, the kiosk timeouts, the permitted login attempts and the minimum password length should all be stored in the database and editable through a settings screen. Changing a value should take effect without the program being restarted. An invalid or missing value should fall back to a sensible default rather than causing a failure.</w:t>
+      </w:r>
+    </w:p>
     <w:sectPr>
       <w:headerReference w:type="even" r:id="rId23"/>
       <w:headerReference w:type="default" r:id="rId24"/>

</xml_diff>

<commit_message>
added objective 33 to the investigation doc
</commit_message>
<xml_diff>
--- a/Investigation.docx
+++ b/Investigation.docx
@@ -10797,6 +10797,39 @@
         <w:t xml:space="preserve"> Values including the advertising and turnaround allowances, the opening and closing times, the rounding interval, the default ticket price, the maximum seats per sale, the kiosk timeouts, the permitted login attempts and the minimum password length should all be stored in the database and editable through a settings screen. Changing a value should take effect without the program being restarted. An invalid or missing value should fall back to a sensible default rather than causing a failure.</w:t>
       </w:r>
     </w:p>
+    <w:p>
+      <w:pPr>
+        <w:spacing w:after="80" w:line="276" w:lineRule="auto"/>
+        <w:jc w:val="both"/>
+        <w:rPr>
+          <w:b/>
+          <w:bCs/>
+        </w:rPr>
+      </w:pPr>
+      <w:r>
+        <w:rPr>
+          <w:b/>
+          <w:bCs/>
+        </w:rPr>
+        <w:t xml:space="preserve">Objective 33: The main menu must present the manager and the member of staff with the information relevant to their role at the start of a shift, rather than presenting only a list of buttons.</w:t>
+      </w:r>
+    </w:p>
+    <w:p>
+      <w:pPr>
+        <w:spacing w:after="80" w:line="276" w:lineRule="auto"/>
+        <w:jc w:val="both"/>
+      </w:pPr>
+      <w:r>
+        <w:rPr>
+          <w:b/>
+          <w:bCs/>
+        </w:rPr>
+        <w:t>Success Criteria:</w:t>
+      </w:r>
+      <w:r>
+        <w:t xml:space="preserve"> The menu should display live figures read from the database when it opens and should refresh them automatically. A manager should see takings and overall occupancy, while a member of staff should see seats sold, items sold and seats remaining, with no monetary figures displayed anywhere. Screenings approaching capacity should be highlighted. The navigation should be grouped by area and should close up correctly when options are hidden for a lower access level.</w:t>
+      </w:r>
+    </w:p>
     <w:sectPr>
       <w:headerReference w:type="even" r:id="rId23"/>
       <w:headerReference w:type="default" r:id="rId24"/>

</xml_diff>

<commit_message>
added objective 34 to the investigation doc
</commit_message>
<xml_diff>
--- a/Investigation.docx
+++ b/Investigation.docx
@@ -10830,6 +10830,39 @@
         <w:t xml:space="preserve"> The menu should display live figures read from the database when it opens and should refresh them automatically. A manager should see takings and overall occupancy, while a member of staff should see seats sold, items sold and seats remaining, with no monetary figures displayed anywhere. Screenings approaching capacity should be highlighted. The navigation should be grouped by area and should close up correctly when options are hidden for a lower access level.</w:t>
       </w:r>
     </w:p>
+    <w:p>
+      <w:pPr>
+        <w:spacing w:after="80" w:line="276" w:lineRule="auto"/>
+        <w:jc w:val="both"/>
+        <w:rPr>
+          <w:b/>
+          <w:bCs/>
+        </w:rPr>
+      </w:pPr>
+      <w:r>
+        <w:rPr>
+          <w:b/>
+          <w:bCs/>
+        </w:rPr>
+        <w:t xml:space="preserve">Objective 34: The system must warn a user before unsaved data entry is discarded, and must confirm before any action that destroys data, with the safe option selected by default.</w:t>
+      </w:r>
+    </w:p>
+    <w:p>
+      <w:pPr>
+        <w:spacing w:after="80" w:line="276" w:lineRule="auto"/>
+        <w:jc w:val="both"/>
+      </w:pPr>
+      <w:r>
+        <w:rPr>
+          <w:b/>
+          <w:bCs/>
+        </w:rPr>
+        <w:t>Success Criteria:</w:t>
+      </w:r>
+      <w:r>
+        <w:t xml:space="preserve"> Selecting a different record while data has been typed into the entry fields should prompt before the typed data is replaced, and should not prompt when nothing has been typed. Every confirmation which deletes, cancels or refunds should open with the negative option selected so that pressing Enter does not destroy anything. No record screen should report a successful save when the underlying database operation has failed.</w:t>
+      </w:r>
+    </w:p>
     <w:sectPr>
       <w:headerReference w:type="even" r:id="rId23"/>
       <w:headerReference w:type="default" r:id="rId24"/>

</xml_diff>